<commit_message>
fix: reducer2 and .pdf, .dox
</commit_message>
<xml_diff>
--- a/ПР2.docx
+++ b/ПР2.docx
@@ -180,7 +180,7 @@
               </wp:anchor>
             </w:drawing>
           </mc:Choice>
-          <mc:Fallback xmlns:w16du="http://schemas.microsoft.com/office/word/2023/wordml/word16du" xmlns:w16sdtfl="http://schemas.microsoft.com/office/word/2024/wordml/sdtformatlock">
+          <mc:Fallback xmlns:w16sdtfl="http://schemas.microsoft.com/office/word/2024/wordml/sdtformatlock" xmlns:w16du="http://schemas.microsoft.com/office/word/2023/wordml/word16du">
             <w:pict>
               <v:line w14:anchorId="340C55D8" id="Фигура1_7" o:spid="_x0000_s1026" style="position:absolute;z-index:251654656;visibility:visible;mso-wrap-style:square;mso-wrap-distance-left:0;mso-wrap-distance-top:0;mso-wrap-distance-right:0;mso-wrap-distance-bottom:0;mso-position-horizontal:absolute;mso-position-horizontal-relative:text;mso-position-vertical:absolute;mso-position-vertical-relative:text" from="73.4pt,1.65pt" to="410.55pt,1.75pt" o:gfxdata="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" o:allowincell="f" strokeweight="0"/>
             </w:pict>
@@ -284,7 +284,7 @@
               </wp:anchor>
             </w:drawing>
           </mc:Choice>
-          <mc:Fallback xmlns:w16du="http://schemas.microsoft.com/office/word/2023/wordml/word16du" xmlns:w16sdtfl="http://schemas.microsoft.com/office/word/2024/wordml/sdtformatlock">
+          <mc:Fallback xmlns:w16sdtfl="http://schemas.microsoft.com/office/word/2024/wordml/sdtformatlock" xmlns:w16du="http://schemas.microsoft.com/office/word/2023/wordml/word16du">
             <w:pict>
               <v:line w14:anchorId="41F719F4" id="Фигура1_8" o:spid="_x0000_s1026" style="position:absolute;z-index:251655680;visibility:visible;mso-wrap-style:square;mso-wrap-distance-left:0;mso-wrap-distance-top:0;mso-wrap-distance-right:0;mso-wrap-distance-bottom:0;mso-position-horizontal:absolute;mso-position-horizontal-relative:text;mso-position-vertical:absolute;mso-position-vertical-relative:text" from="73.4pt,1.65pt" to="410.55pt,2.1pt" o:gfxdata="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" o:allowincell="f" strokeweight="0"/>
             </w:pict>
@@ -531,7 +531,7 @@
               </wp:anchor>
             </w:drawing>
           </mc:Choice>
-          <mc:Fallback xmlns:w16du="http://schemas.microsoft.com/office/word/2023/wordml/word16du" xmlns:w16sdtfl="http://schemas.microsoft.com/office/word/2024/wordml/sdtformatlock">
+          <mc:Fallback xmlns:w16sdtfl="http://schemas.microsoft.com/office/word/2024/wordml/sdtformatlock" xmlns:w16du="http://schemas.microsoft.com/office/word/2023/wordml/word16du">
             <w:pict>
               <v:line w14:anchorId="7B4A7039" id="Фигура1_5" o:spid="_x0000_s1026" style="position:absolute;z-index:251658752;visibility:visible;mso-wrap-style:square;mso-wrap-distance-left:0;mso-wrap-distance-top:0;mso-wrap-distance-right:0;mso-wrap-distance-bottom:0;mso-position-horizontal:absolute;mso-position-horizontal-relative:text;mso-position-vertical:absolute;mso-position-vertical-relative:text" from="73.4pt,1.65pt" to="410.55pt,2.1pt" o:gfxdata="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" o:allowincell="f" strokeweight="0"/>
             </w:pict>
@@ -757,7 +757,7 @@
               </wp:anchor>
             </w:drawing>
           </mc:Choice>
-          <mc:Fallback xmlns:w16du="http://schemas.microsoft.com/office/word/2023/wordml/word16du" xmlns:w16sdtfl="http://schemas.microsoft.com/office/word/2024/wordml/sdtformatlock">
+          <mc:Fallback xmlns:w16sdtfl="http://schemas.microsoft.com/office/word/2024/wordml/sdtformatlock" xmlns:w16du="http://schemas.microsoft.com/office/word/2023/wordml/word16du">
             <w:pict>
               <v:line w14:anchorId="5D635709" id="Фигура1_1" o:spid="_x0000_s1026" style="position:absolute;z-index:251649536;visibility:visible;mso-wrap-style:square;mso-wrap-distance-left:0;mso-wrap-distance-top:0;mso-wrap-distance-right:0;mso-wrap-distance-bottom:0;mso-position-horizontal:absolute;mso-position-horizontal-relative:text;mso-position-vertical:absolute;mso-position-vertical-relative:text" from="324.3pt,1.35pt" to="433.45pt,1.6pt" o:gfxdata="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" o:allowincell="f" strokeweight="0"/>
             </w:pict>
@@ -822,7 +822,7 @@
               </wp:anchor>
             </w:drawing>
           </mc:Choice>
-          <mc:Fallback xmlns:w16du="http://schemas.microsoft.com/office/word/2023/wordml/word16du" xmlns:w16sdtfl="http://schemas.microsoft.com/office/word/2024/wordml/sdtformatlock">
+          <mc:Fallback xmlns:w16sdtfl="http://schemas.microsoft.com/office/word/2024/wordml/sdtformatlock" xmlns:w16du="http://schemas.microsoft.com/office/word/2023/wordml/word16du">
             <w:pict>
               <v:line w14:anchorId="28086E2E" id="Фигура1_2" o:spid="_x0000_s1026" style="position:absolute;flip:y;z-index:251661824;visibility:visible;mso-wrap-style:square;mso-wrap-distance-left:0;mso-wrap-distance-top:0;mso-wrap-distance-right:0;mso-wrap-distance-bottom:0;mso-position-horizontal:absolute;mso-position-horizontal-relative:text;mso-position-vertical:absolute;mso-position-vertical-relative:text" from="210.35pt,1.45pt" to="312.05pt,1.7pt" o:gfxdata="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" o:allowincell="f" strokeweight="0"/>
             </w:pict>
@@ -1004,7 +1004,7 @@
               </wp:anchor>
             </w:drawing>
           </mc:Choice>
-          <mc:Fallback xmlns:w16du="http://schemas.microsoft.com/office/word/2023/wordml/word16du" xmlns:w16sdtfl="http://schemas.microsoft.com/office/word/2024/wordml/sdtformatlock">
+          <mc:Fallback xmlns:w16sdtfl="http://schemas.microsoft.com/office/word/2024/wordml/sdtformatlock" xmlns:w16du="http://schemas.microsoft.com/office/word/2023/wordml/word16du">
             <w:pict>
               <v:line w14:anchorId="5A3DAE89" id="Фигура1_0" o:spid="_x0000_s1026" style="position:absolute;z-index:251650560;visibility:visible;mso-wrap-style:square;mso-wrap-distance-left:0;mso-wrap-distance-top:0;mso-wrap-distance-right:0;mso-wrap-distance-bottom:0;mso-position-horizontal:absolute;mso-position-horizontal-relative:text;mso-position-vertical:absolute;mso-position-vertical-relative:text" from="210.35pt,1.7pt" to="312.05pt,2.15pt" o:gfxdata="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" o:allowincell="f" strokeweight="0"/>
             </w:pict>
@@ -1069,7 +1069,7 @@
               </wp:anchor>
             </w:drawing>
           </mc:Choice>
-          <mc:Fallback xmlns:w16du="http://schemas.microsoft.com/office/word/2023/wordml/word16du" xmlns:w16sdtfl="http://schemas.microsoft.com/office/word/2024/wordml/sdtformatlock">
+          <mc:Fallback xmlns:w16sdtfl="http://schemas.microsoft.com/office/word/2024/wordml/sdtformatlock" xmlns:w16du="http://schemas.microsoft.com/office/word/2023/wordml/word16du">
             <w:pict>
               <v:line w14:anchorId="168157E8" id="Фигура1_4" o:spid="_x0000_s1026" style="position:absolute;z-index:251652608;visibility:visible;mso-wrap-style:square;mso-wrap-distance-left:0;mso-wrap-distance-top:0;mso-wrap-distance-right:0;mso-wrap-distance-bottom:0;mso-position-horizontal:absolute;mso-position-horizontal-relative:text;mso-position-vertical:absolute;mso-position-vertical-relative:text" from="49.9pt,1.35pt" to="197.35pt,1.6pt" o:gfxdata="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" o:allowincell="f" strokeweight="0"/>
             </w:pict>
@@ -1134,7 +1134,7 @@
               </wp:anchor>
             </w:drawing>
           </mc:Choice>
-          <mc:Fallback xmlns:w16du="http://schemas.microsoft.com/office/word/2023/wordml/word16du" xmlns:w16sdtfl="http://schemas.microsoft.com/office/word/2024/wordml/sdtformatlock">
+          <mc:Fallback xmlns:w16sdtfl="http://schemas.microsoft.com/office/word/2024/wordml/sdtformatlock" xmlns:w16du="http://schemas.microsoft.com/office/word/2023/wordml/word16du">
             <w:pict>
               <v:line w14:anchorId="06C71DB7" id="Фигура1_3" o:spid="_x0000_s1026" style="position:absolute;z-index:251659776;visibility:visible;mso-wrap-style:square;mso-wrap-distance-left:0;mso-wrap-distance-top:0;mso-wrap-distance-right:0;mso-wrap-distance-bottom:0;mso-position-horizontal:absolute;mso-position-horizontal-relative:text;mso-position-vertical:absolute;mso-position-vertical-relative:text" from="324.3pt,1.35pt" to="433.45pt,1.6pt" o:gfxdata="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" o:allowincell="f" strokeweight="0"/>
             </w:pict>
@@ -1531,7 +1531,10 @@
         <w:rPr>
           <w:lang w:val="en-US"/>
         </w:rPr>
-        <w:t>mapper-</w:t>
+        <w:t>mapper</w:t>
+      </w:r>
+      <w:r>
+        <w:t>-</w:t>
       </w:r>
       <w:r>
         <w:t>а</w:t>
@@ -1992,7 +1995,10 @@
         <w:rPr>
           <w:lang w:val="en-US"/>
         </w:rPr>
-        <w:t>mapper-</w:t>
+        <w:t>mapper</w:t>
+      </w:r>
+      <w:r>
+        <w:t>-</w:t>
       </w:r>
       <w:r>
         <w:t>а</w:t>
@@ -2043,15 +2049,12 @@
         </w:rPr>
       </w:pPr>
       <w:r>
-        <w:rPr>
-          <w:lang w:val="en-US"/>
-        </w:rPr>
         <w:lastRenderedPageBreak/>
         <w:drawing>
-          <wp:inline distT="0" distB="0" distL="0" distR="0" wp14:anchorId="0E4C0D7E" wp14:editId="187BAC79">
-            <wp:extent cx="5161269" cy="3555268"/>
-            <wp:effectExtent l="0" t="0" r="0" b="1270"/>
-            <wp:docPr id="1933609787" name="Рисунок 6"/>
+          <wp:inline distT="0" distB="0" distL="0" distR="0" wp14:anchorId="30730F2E" wp14:editId="792CD43B">
+            <wp:extent cx="5396230" cy="3779265"/>
+            <wp:effectExtent l="0" t="0" r="1270" b="5715"/>
+            <wp:docPr id="659767327" name="Рисунок 2"/>
             <wp:cNvGraphicFramePr>
               <a:graphicFrameLocks xmlns:a="http://schemas.openxmlformats.org/drawingml/2006/main" noChangeAspect="1"/>
             </wp:cNvGraphicFramePr>
@@ -2059,11 +2062,11 @@
               <a:graphicData uri="http://schemas.openxmlformats.org/drawingml/2006/picture">
                 <pic:pic xmlns:pic="http://schemas.openxmlformats.org/drawingml/2006/picture">
                   <pic:nvPicPr>
-                    <pic:cNvPr id="1933609787" name="Рисунок 1933609787"/>
+                    <pic:cNvPr id="659767327" name="Рисунок 659767327"/>
                     <pic:cNvPicPr/>
                   </pic:nvPicPr>
                   <pic:blipFill>
-                    <a:blip r:embed="rId13" cstate="print">
+                    <a:blip r:embed="rId13">
                       <a:extLst>
                         <a:ext uri="{28A0092B-C50C-407E-A947-70E740481C1C}">
                           <a14:useLocalDpi xmlns:a14="http://schemas.microsoft.com/office/drawing/2010/main" val="0"/>
@@ -2077,7 +2080,7 @@
                   <pic:spPr>
                     <a:xfrm>
                       <a:off x="0" y="0"/>
-                      <a:ext cx="5194764" cy="3578340"/>
+                      <a:ext cx="5398283" cy="3780703"/>
                     </a:xfrm>
                     <a:prstGeom prst="rect">
                       <a:avLst/>
@@ -2095,19 +2098,19 @@
         <w:pStyle w:val="af2"/>
       </w:pPr>
       <w:r>
+        <w:t xml:space="preserve"> </w:t>
+      </w:r>
+      <w:r>
+        <w:t xml:space="preserve">Рисунок 6 – Код второго </w:t>
+      </w:r>
+      <w:r>
         <w:rPr>
           <w:lang w:val="en-US"/>
         </w:rPr>
-        <w:t xml:space="preserve"> </w:t>
-      </w:r>
-      <w:r>
-        <w:t xml:space="preserve">Рисунок 6 – Код второго </w:t>
-      </w:r>
-      <w:r>
-        <w:rPr>
-          <w:lang w:val="en-US"/>
-        </w:rPr>
-        <w:t>reducer-</w:t>
+        <w:t>reducer</w:t>
+      </w:r>
+      <w:r>
+        <w:t>-</w:t>
       </w:r>
       <w:r>
         <w:t>а</w:t>
@@ -2228,11 +2231,11 @@
       </w:r>
       <w:proofErr w:type="spellEnd"/>
       <w:r>
-        <w:t xml:space="preserve"> с запросом GET /big_image.png и почти десятью миллионами повторений, остальные три позиции распределились между пользователями, у которых количество повторений лучшего запроса </w:t>
+        <w:t xml:space="preserve"> с запросом GET /big_image.png и почти десятью миллионами повторений, остальные три позиции распределились </w:t>
       </w:r>
       <w:r>
         <w:lastRenderedPageBreak/>
-        <w:t>находится в диапазоне 274–276 тысяч. Результат работы второго шага представлен на рисунке 8.</w:t>
+        <w:t>между пользователями, у которых количество повторений лучшего запроса находится в диапазоне 274–276 тысяч. Результат работы второго шага представлен на рисунке 8.</w:t>
       </w:r>
     </w:p>
     <w:p>
@@ -2247,10 +2250,10 @@
           <w:lang w:val="en-US"/>
         </w:rPr>
         <w:drawing>
-          <wp:inline distT="0" distB="0" distL="0" distR="0" wp14:anchorId="7EE96964" wp14:editId="69D297B5">
-            <wp:extent cx="5207000" cy="1054100"/>
-            <wp:effectExtent l="0" t="0" r="0" b="0"/>
-            <wp:docPr id="1505625203" name="Рисунок 8"/>
+          <wp:inline distT="0" distB="0" distL="0" distR="0" wp14:anchorId="41AD0D3F" wp14:editId="38629B65">
+            <wp:extent cx="4832350" cy="913291"/>
+            <wp:effectExtent l="0" t="0" r="0" b="1270"/>
+            <wp:docPr id="2130754377" name="Рисунок 1"/>
             <wp:cNvGraphicFramePr>
               <a:graphicFrameLocks xmlns:a="http://schemas.openxmlformats.org/drawingml/2006/main" noChangeAspect="1"/>
             </wp:cNvGraphicFramePr>
@@ -2258,7 +2261,7 @@
               <a:graphicData uri="http://schemas.openxmlformats.org/drawingml/2006/picture">
                 <pic:pic xmlns:pic="http://schemas.openxmlformats.org/drawingml/2006/picture">
                   <pic:nvPicPr>
-                    <pic:cNvPr id="1505625203" name="Рисунок 1505625203"/>
+                    <pic:cNvPr id="2130754377" name="Рисунок 2130754377"/>
                     <pic:cNvPicPr/>
                   </pic:nvPicPr>
                   <pic:blipFill>
@@ -2276,7 +2279,7 @@
                   <pic:spPr>
                     <a:xfrm>
                       <a:off x="0" y="0"/>
-                      <a:ext cx="5207000" cy="1054100"/>
+                      <a:ext cx="4855646" cy="917694"/>
                     </a:xfrm>
                     <a:prstGeom prst="rect">
                       <a:avLst/>

</xml_diff>